<commit_message>
Add References section and retitle to IT Technical Lead
- CV: new REFERENCES section (2 named referees + "available on
  request" line)
- CV: "Technical Lead" -> "IT Technical Lead" in the title, profile
  opening line, and the Projects group label

Co-Authored-By: Claude Sonnet 5 <noreply@anthropic.com>
</commit_message>
<xml_diff>
--- a/Elvis CV/Elvis_Nosakhare_CV_Technical_Lead.docx
+++ b/Elvis CV/Elvis_Nosakhare_CV_Technical_Lead.docx
@@ -34,7 +34,7 @@
           <w:sz w:val="22"/>
           <w:szCs w:val="22"/>
         </w:rPr>
-        <w:t xml:space="preserve">Technical Lead &amp; Full-Stack Developer</w:t>
+        <w:t xml:space="preserve">IT Technical Lead &amp; Full-Stack Developer</w:t>
       </w:r>
     </w:p>
     <w:p>
@@ -57,7 +57,7 @@
         <w:spacing w:after="30"/>
         <w:jc w:val="center"/>
       </w:pPr>
-      <w:hyperlink w:history="1" r:id="rId5t334ysujrvfnplecxtjq">
+      <w:hyperlink w:history="1" r:id="rIdawtge8xt3n1jp2cgxmoeo">
         <w:r>
           <w:rPr>
             <w:rFonts w:ascii="Calibri" w:cs="Calibri" w:eastAsia="Calibri" w:hAnsi="Calibri"/>
@@ -78,7 +78,7 @@
         </w:rPr>
         <w:t xml:space="preserve">   |   </w:t>
       </w:r>
-      <w:hyperlink w:history="1" r:id="rIdoimh_l1pyaps6723hzw6a">
+      <w:hyperlink w:history="1" r:id="rIdtfks50ozbdgzomc1bmbcn">
         <w:r>
           <w:rPr>
             <w:rFonts w:ascii="Calibri" w:cs="Calibri" w:eastAsia="Calibri" w:hAnsi="Calibri"/>
@@ -99,7 +99,7 @@
         </w:rPr>
         <w:t xml:space="preserve">   |   </w:t>
       </w:r>
-      <w:hyperlink w:history="1" r:id="rIdbprtf4lwr-y7duzemoonc">
+      <w:hyperlink w:history="1" r:id="rIdxgasuqawp90qj4kdqx2pn">
         <w:r>
           <w:rPr>
             <w:rFonts w:ascii="Calibri" w:cs="Calibri" w:eastAsia="Calibri" w:hAnsi="Calibri"/>
@@ -168,7 +168,7 @@
           <w:sz w:val="19"/>
           <w:szCs w:val="19"/>
         </w:rPr>
-        <w:t xml:space="preserve">Technical lead and full-stack developer, currently IT Director for a Nigeria- and Rwanda-based financial-services group. I lead an eight-person engineering, design, and QA team, own the technical roadmap for every project, and manage the vendors and regulators that come with banking and insurance work. I stay hands-on — building production web and mobile products end-to-end in React, Next.js, TanStack Start, and TypeScript, with Claude Code as my daily driver and AI features on the Anthropic Claude API. Trained in Agile DSDM; pursuing PMP.</w:t>
+        <w:t xml:space="preserve">IT technical lead and full-stack developer, currently IT Director for a Nigeria- and Rwanda-based financial-services group. I lead an eight-person engineering, design, and QA team, own the technical roadmap for every project, and manage the vendors and regulators that come with banking and insurance work. I stay hands-on — building production web and mobile products end-to-end in React, Next.js, TanStack Start, and TypeScript, with Claude Code as my daily driver and AI features on the Anthropic Claude API. Trained in Agile DSDM; pursuing PMP.</w:t>
       </w:r>
     </w:p>
     <w:p>
@@ -693,7 +693,7 @@
           <w:sz w:val="16"/>
           <w:szCs w:val="16"/>
         </w:rPr>
-        <w:t xml:space="preserve">AS TECHNICAL LEAD  —  STANDARD LIFE ENTERPRISE SYSTEMS</w:t>
+        <w:t xml:space="preserve">AS IT TECHNICAL LEAD  —  STANDARD LIFE ENTERPRISE SYSTEMS</w:t>
       </w:r>
     </w:p>
     <w:p>
@@ -887,7 +887,7 @@
         </w:rPr>
         <w:t xml:space="preserve">  —  </w:t>
       </w:r>
-      <w:hyperlink w:history="1" r:id="rId_kf1yenfywqwht5dr_fqq">
+      <w:hyperlink w:history="1" r:id="rIdvhra4kyytv2f2xihrp4j2">
         <w:r>
           <w:rPr>
             <w:rFonts w:ascii="Calibri" w:cs="Calibri" w:eastAsia="Calibri" w:hAnsi="Calibri"/>
@@ -957,7 +957,7 @@
         </w:rPr>
         <w:t xml:space="preserve">  —  </w:t>
       </w:r>
-      <w:hyperlink w:history="1" r:id="rIdq8vb6w_tafwoks2mf9q74">
+      <w:hyperlink w:history="1" r:id="rIde28-q5bl0o9_4oaw_ta3u">
         <w:r>
           <w:rPr>
             <w:rFonts w:ascii="Calibri" w:cs="Calibri" w:eastAsia="Calibri" w:hAnsi="Calibri"/>
@@ -1027,7 +1027,7 @@
         </w:rPr>
         <w:t xml:space="preserve">  —  </w:t>
       </w:r>
-      <w:hyperlink w:history="1" r:id="rIdowcwv8_sspubpuqzcrh6e">
+      <w:hyperlink w:history="1" r:id="rIdzhjtaqgcy0lpafven4lnl">
         <w:r>
           <w:rPr>
             <w:rFonts w:ascii="Calibri" w:cs="Calibri" w:eastAsia="Calibri" w:hAnsi="Calibri"/>
@@ -1097,7 +1097,7 @@
         </w:rPr>
         <w:t xml:space="preserve">  —  </w:t>
       </w:r>
-      <w:hyperlink w:history="1" r:id="rIddaqwpyxlc74gidijmyu2p">
+      <w:hyperlink w:history="1" r:id="rIdsyx1mnksrt-xdz-vnxdrn">
         <w:r>
           <w:rPr>
             <w:rFonts w:ascii="Calibri" w:cs="Calibri" w:eastAsia="Calibri" w:hAnsi="Calibri"/>
@@ -1167,7 +1167,7 @@
         </w:rPr>
         <w:t xml:space="preserve">  —  </w:t>
       </w:r>
-      <w:hyperlink w:history="1" r:id="rIdai04fl7py8xe0srzwxol1">
+      <w:hyperlink w:history="1" r:id="rIdl-h7y1f2oxzoxfe790u1n">
         <w:r>
           <w:rPr>
             <w:rFonts w:ascii="Calibri" w:cs="Calibri" w:eastAsia="Calibri" w:hAnsi="Calibri"/>
@@ -1237,7 +1237,7 @@
         </w:rPr>
         <w:t xml:space="preserve">  —  </w:t>
       </w:r>
-      <w:hyperlink w:history="1" r:id="rIdrt_jx6qdktlvporpkgoik">
+      <w:hyperlink w:history="1" r:id="rId9okl7nzmpo3ixw_v0fbqh">
         <w:r>
           <w:rPr>
             <w:rFonts w:ascii="Calibri" w:cs="Calibri" w:eastAsia="Calibri" w:hAnsi="Calibri"/>
@@ -1307,7 +1307,7 @@
         </w:rPr>
         <w:t xml:space="preserve">  —  </w:t>
       </w:r>
-      <w:hyperlink w:history="1" r:id="rIddufqc_otmruoaz6aaz41g">
+      <w:hyperlink w:history="1" r:id="rIdesgbhom7fwwtxd9mr6kuv">
         <w:r>
           <w:rPr>
             <w:rFonts w:ascii="Calibri" w:cs="Calibri" w:eastAsia="Calibri" w:hAnsi="Calibri"/>
@@ -1377,7 +1377,7 @@
         </w:rPr>
         <w:t xml:space="preserve">  —  </w:t>
       </w:r>
-      <w:hyperlink w:history="1" r:id="rIdt2qh2crk7hkfszbgb3z8x">
+      <w:hyperlink w:history="1" r:id="rIdsn6zwe3o-l_gndoi80tny">
         <w:r>
           <w:rPr>
             <w:rFonts w:ascii="Calibri" w:cs="Calibri" w:eastAsia="Calibri" w:hAnsi="Calibri"/>
@@ -1516,6 +1516,131 @@
           <w:szCs w:val="18"/>
         </w:rPr>
         <w:t xml:space="preserve">Agile DSDM (trained) · Jira &amp; sprint planning · Prompt engineering · Workflow thinking &amp; automation · PMP (in progress)</w:t>
+      </w:r>
+    </w:p>
+    <w:p>
+      <w:pPr>
+        <w:pBdr>
+          <w:bottom w:val="single" w:color="B5720A" w:sz="10" w:space="3"/>
+        </w:pBdr>
+        <w:spacing w:after="70" w:before="190"/>
+      </w:pPr>
+      <w:r>
+        <w:rPr>
+          <w:rFonts w:ascii="Calibri" w:cs="Calibri" w:eastAsia="Calibri" w:hAnsi="Calibri"/>
+          <w:b/>
+          <w:bCs/>
+          <w:color w:val="0C2340"/>
+          <w:spacing w:val="20"/>
+          <w:sz w:val="20"/>
+          <w:szCs w:val="20"/>
+        </w:rPr>
+        <w:t xml:space="preserve">REFERENCES</w:t>
+      </w:r>
+    </w:p>
+    <w:p>
+      <w:pPr>
+        <w:spacing w:after="26"/>
+      </w:pPr>
+      <w:r>
+        <w:rPr>
+          <w:rFonts w:ascii="Calibri" w:cs="Calibri" w:eastAsia="Calibri" w:hAnsi="Calibri"/>
+          <w:b/>
+          <w:bCs/>
+          <w:color w:val="0C2340"/>
+          <w:sz w:val="19"/>
+          <w:szCs w:val="19"/>
+        </w:rPr>
+        <w:t xml:space="preserve">Mr. Adedeji Olowe</w:t>
+      </w:r>
+      <w:r>
+        <w:rPr>
+          <w:rFonts w:ascii="Calibri" w:cs="Calibri" w:eastAsia="Calibri" w:hAnsi="Calibri"/>
+          <w:color w:val="44515E"/>
+          <w:sz w:val="18"/>
+          <w:szCs w:val="18"/>
+        </w:rPr>
+        <w:t xml:space="preserve">  —  CEO, Lendsqr Technologies</w:t>
+      </w:r>
+      <w:r>
+        <w:rPr>
+          <w:rFonts w:ascii="Calibri" w:cs="Calibri" w:eastAsia="Calibri" w:hAnsi="Calibri"/>
+          <w:color w:val="44515E"/>
+          <w:sz w:val="17"/>
+          <w:szCs w:val="17"/>
+        </w:rPr>
+        <w:t xml:space="preserve">   ·   </w:t>
+      </w:r>
+      <w:hyperlink w:history="1" r:id="rId3v-lctnv2p0switkoswes">
+        <w:r>
+          <w:rPr>
+            <w:rFonts w:ascii="Calibri" w:cs="Calibri" w:eastAsia="Calibri" w:hAnsi="Calibri"/>
+            <w:color w:val="B5720A"/>
+            <w:sz w:val="17"/>
+            <w:szCs w:val="17"/>
+            <w:u w:val="single"/>
+          </w:rPr>
+          <w:t xml:space="preserve">adedeji@lendsqr.com</w:t>
+        </w:r>
+      </w:hyperlink>
+      <w:r>
+        <w:rPr>
+          <w:rFonts w:ascii="Calibri" w:cs="Calibri" w:eastAsia="Calibri" w:hAnsi="Calibri"/>
+          <w:color w:val="44515E"/>
+          <w:sz w:val="17"/>
+          <w:szCs w:val="17"/>
+        </w:rPr>
+        <w:t xml:space="preserve">  ·  +234 703 413 8291</w:t>
+      </w:r>
+    </w:p>
+    <w:p>
+      <w:pPr>
+        <w:spacing w:after="26"/>
+      </w:pPr>
+      <w:r>
+        <w:rPr>
+          <w:rFonts w:ascii="Calibri" w:cs="Calibri" w:eastAsia="Calibri" w:hAnsi="Calibri"/>
+          <w:b/>
+          <w:bCs/>
+          <w:color w:val="0C2340"/>
+          <w:sz w:val="19"/>
+          <w:szCs w:val="19"/>
+        </w:rPr>
+        <w:t xml:space="preserve">Mr. Ugo Kelvin</w:t>
+      </w:r>
+      <w:r>
+        <w:rPr>
+          <w:rFonts w:ascii="Calibri" w:cs="Calibri" w:eastAsia="Calibri" w:hAnsi="Calibri"/>
+          <w:color w:val="44515E"/>
+          <w:sz w:val="18"/>
+          <w:szCs w:val="18"/>
+        </w:rPr>
+        <w:t xml:space="preserve">  —  Co-Founder, Egis Technologies Ltd.</w:t>
+      </w:r>
+      <w:r>
+        <w:rPr>
+          <w:rFonts w:ascii="Calibri" w:cs="Calibri" w:eastAsia="Calibri" w:hAnsi="Calibri"/>
+          <w:color w:val="44515E"/>
+          <w:sz w:val="17"/>
+          <w:szCs w:val="17"/>
+        </w:rPr>
+        <w:t xml:space="preserve">   ·   +234 703 020 2868</w:t>
+      </w:r>
+    </w:p>
+    <w:p>
+      <w:pPr>
+        <w:spacing w:before="4"/>
+      </w:pPr>
+      <w:r>
+        <w:rPr>
+          <w:rFonts w:ascii="Calibri" w:cs="Calibri" w:eastAsia="Calibri" w:hAnsi="Calibri"/>
+          <w:i/>
+          <w:iCs/>
+          <w:color w:val="44515E"/>
+          <w:sz w:val="17"/>
+          <w:szCs w:val="17"/>
+        </w:rPr>
+        <w:t xml:space="preserve">Additional references available on request.</w:t>
       </w:r>
     </w:p>
     <w:sectPr>

</xml_diff>